<commit_message>
Make 'No Activity performed by Operisoft' line bold
</commit_message>
<xml_diff>
--- a/Aptech-Weekly-Status-Report-DEMO.docx
+++ b/Aptech-Weekly-Status-Report-DEMO.docx
@@ -3765,7 +3765,7 @@
       <w:r>
         <w:rPr>
           <w:rFonts w:ascii="Arial" w:hAnsi="Arial"/>
-          <w:b w:val="0"/>
+          <w:b/>
           <w:i w:val="0"/>
           <w:sz w:val="22"/>
         </w:rPr>
@@ -4231,7 +4231,7 @@
       <w:r>
         <w:rPr>
           <w:rFonts w:ascii="Arial" w:hAnsi="Arial"/>
-          <w:b w:val="0"/>
+          <w:b/>
           <w:i w:val="0"/>
           <w:sz w:val="22"/>
         </w:rPr>
@@ -4766,7 +4766,7 @@
       <w:r>
         <w:rPr>
           <w:rFonts w:ascii="Arial" w:hAnsi="Arial"/>
-          <w:b w:val="0"/>
+          <w:b/>
           <w:i w:val="0"/>
           <w:sz w:val="22"/>
         </w:rPr>
@@ -5011,7 +5011,7 @@
       <w:r>
         <w:rPr>
           <w:rFonts w:ascii="Arial" w:hAnsi="Arial"/>
-          <w:b w:val="0"/>
+          <w:b/>
           <w:i w:val="0"/>
           <w:sz w:val="22"/>
         </w:rPr>
@@ -5643,7 +5643,7 @@
       <w:r>
         <w:rPr>
           <w:rFonts w:ascii="Arial" w:hAnsi="Arial"/>
-          <w:b w:val="0"/>
+          <w:b/>
           <w:i w:val="0"/>
           <w:sz w:val="22"/>
         </w:rPr>
@@ -6178,7 +6178,7 @@
       <w:r>
         <w:rPr>
           <w:rFonts w:ascii="Arial" w:hAnsi="Arial"/>
-          <w:b w:val="0"/>
+          <w:b/>
           <w:i w:val="0"/>
           <w:sz w:val="22"/>
         </w:rPr>
@@ -6437,7 +6437,7 @@
       <w:r>
         <w:rPr>
           <w:rFonts w:ascii="Arial" w:hAnsi="Arial"/>
-          <w:b w:val="0"/>
+          <w:b/>
           <w:i w:val="0"/>
           <w:sz w:val="22"/>
         </w:rPr>
@@ -6889,7 +6889,7 @@
       <w:r>
         <w:rPr>
           <w:rFonts w:ascii="Arial" w:hAnsi="Arial"/>
-          <w:b w:val="0"/>
+          <w:b/>
           <w:i w:val="0"/>
           <w:sz w:val="22"/>
         </w:rPr>
@@ -7438,7 +7438,7 @@
       <w:r>
         <w:rPr>
           <w:rFonts w:ascii="Arial" w:hAnsi="Arial"/>
-          <w:b w:val="0"/>
+          <w:b/>
           <w:i w:val="0"/>
           <w:sz w:val="22"/>
         </w:rPr>
@@ -7683,7 +7683,7 @@
       <w:r>
         <w:rPr>
           <w:rFonts w:ascii="Arial" w:hAnsi="Arial"/>
-          <w:b w:val="0"/>
+          <w:b/>
           <w:i w:val="0"/>
           <w:sz w:val="22"/>
         </w:rPr>
@@ -8135,7 +8135,7 @@
       <w:r>
         <w:rPr>
           <w:rFonts w:ascii="Arial" w:hAnsi="Arial"/>
-          <w:b w:val="0"/>
+          <w:b/>
           <w:i w:val="0"/>
           <w:sz w:val="22"/>
         </w:rPr>
@@ -8587,7 +8587,7 @@
       <w:r>
         <w:rPr>
           <w:rFonts w:ascii="Arial" w:hAnsi="Arial"/>
-          <w:b w:val="0"/>
+          <w:b/>
           <w:i w:val="0"/>
           <w:sz w:val="22"/>
         </w:rPr>
@@ -8846,7 +8846,7 @@
       <w:r>
         <w:rPr>
           <w:rFonts w:ascii="Arial" w:hAnsi="Arial"/>
-          <w:b w:val="0"/>
+          <w:b/>
           <w:i w:val="0"/>
           <w:sz w:val="22"/>
         </w:rPr>
@@ -9464,7 +9464,7 @@
       <w:r>
         <w:rPr>
           <w:rFonts w:ascii="Arial" w:hAnsi="Arial"/>
-          <w:b w:val="0"/>
+          <w:b/>
           <w:i w:val="0"/>
           <w:sz w:val="22"/>
         </w:rPr>
@@ -10082,7 +10082,7 @@
       <w:r>
         <w:rPr>
           <w:rFonts w:ascii="Arial" w:hAnsi="Arial"/>
-          <w:b w:val="0"/>
+          <w:b/>
           <w:i w:val="0"/>
           <w:sz w:val="22"/>
         </w:rPr>
@@ -10327,7 +10327,7 @@
       <w:r>
         <w:rPr>
           <w:rFonts w:ascii="Arial" w:hAnsi="Arial"/>
-          <w:b w:val="0"/>
+          <w:b/>
           <w:i w:val="0"/>
           <w:sz w:val="22"/>
         </w:rPr>
@@ -10876,7 +10876,7 @@
       <w:r>
         <w:rPr>
           <w:rFonts w:ascii="Arial" w:hAnsi="Arial"/>
-          <w:b w:val="0"/>
+          <w:b/>
           <w:i w:val="0"/>
           <w:sz w:val="22"/>
         </w:rPr>
@@ -11342,7 +11342,7 @@
       <w:r>
         <w:rPr>
           <w:rFonts w:ascii="Arial" w:hAnsi="Arial"/>
-          <w:b w:val="0"/>
+          <w:b/>
           <w:i w:val="0"/>
           <w:sz w:val="22"/>
         </w:rPr>
@@ -11601,7 +11601,7 @@
       <w:r>
         <w:rPr>
           <w:rFonts w:ascii="Arial" w:hAnsi="Arial"/>
-          <w:b w:val="0"/>
+          <w:b/>
           <w:i w:val="0"/>
           <w:sz w:val="22"/>
         </w:rPr>
@@ -12233,7 +12233,7 @@
       <w:r>
         <w:rPr>
           <w:rFonts w:ascii="Arial" w:hAnsi="Arial"/>
-          <w:b w:val="0"/>
+          <w:b/>
           <w:i w:val="0"/>
           <w:sz w:val="22"/>
         </w:rPr>

</xml_diff>

<commit_message>
Center the account-heading separator rule and keep it on one line
The 128-dash separator under each account name was left-aligned and wrapped,
looking ragged. Center it and shorten to 100 dashes so it stays on one line.
Regenerate the DEMO.
</commit_message>
<xml_diff>
--- a/Aptech-Weekly-Status-Report-DEMO.docx
+++ b/Aptech-Weekly-Status-Report-DEMO.docx
@@ -3860,6 +3860,7 @@
     <w:p>
       <w:pPr>
         <w:spacing w:before="0" w:after="80" w:line="240" w:lineRule="auto"/>
+        <w:jc w:val="center"/>
       </w:pPr>
       <w:r>
         <w:rPr>
@@ -3868,7 +3869,7 @@
           <w:i w:val="0"/>
           <w:sz w:val="19"/>
         </w:rPr>
-        <w:t>--------------------------------------------------------------------------------------------------------------------------------</w:t>
+        <w:t>----------------------------------------------------------------------------------------------------</w:t>
       </w:r>
     </w:p>
     <w:p>
@@ -4432,6 +4433,7 @@
     <w:p>
       <w:pPr>
         <w:spacing w:before="0" w:after="80" w:line="240" w:lineRule="auto"/>
+        <w:jc w:val="center"/>
       </w:pPr>
       <w:r>
         <w:rPr>
@@ -4440,7 +4442,7 @@
           <w:i w:val="0"/>
           <w:sz w:val="19"/>
         </w:rPr>
-        <w:t>--------------------------------------------------------------------------------------------------------------------------------</w:t>
+        <w:t>----------------------------------------------------------------------------------------------------</w:t>
       </w:r>
     </w:p>
     <w:p>
@@ -5113,6 +5115,7 @@
     <w:p>
       <w:pPr>
         <w:spacing w:before="0" w:after="80" w:line="240" w:lineRule="auto"/>
+        <w:jc w:val="center"/>
       </w:pPr>
       <w:r>
         <w:rPr>
@@ -5121,7 +5124,7 @@
           <w:i w:val="0"/>
           <w:sz w:val="19"/>
         </w:rPr>
-        <w:t>--------------------------------------------------------------------------------------------------------------------------------</w:t>
+        <w:t>----------------------------------------------------------------------------------------------------</w:t>
       </w:r>
     </w:p>
     <w:p>
@@ -5395,6 +5398,7 @@
     <w:p>
       <w:pPr>
         <w:spacing w:before="0" w:after="80" w:line="240" w:lineRule="auto"/>
+        <w:jc w:val="center"/>
       </w:pPr>
       <w:r>
         <w:rPr>
@@ -5403,7 +5407,7 @@
           <w:i w:val="0"/>
           <w:sz w:val="19"/>
         </w:rPr>
-        <w:t>--------------------------------------------------------------------------------------------------------------------------------</w:t>
+        <w:t>----------------------------------------------------------------------------------------------------</w:t>
       </w:r>
     </w:p>
     <w:p>
@@ -5967,6 +5971,7 @@
     <w:p>
       <w:pPr>
         <w:spacing w:before="0" w:after="80" w:line="240" w:lineRule="auto"/>
+        <w:jc w:val="center"/>
       </w:pPr>
       <w:r>
         <w:rPr>
@@ -5975,7 +5980,7 @@
           <w:i w:val="0"/>
           <w:sz w:val="19"/>
         </w:rPr>
-        <w:t>--------------------------------------------------------------------------------------------------------------------------------</w:t>
+        <w:t>----------------------------------------------------------------------------------------------------</w:t>
       </w:r>
     </w:p>
     <w:p>
@@ -6482,6 +6487,7 @@
     <w:p>
       <w:pPr>
         <w:spacing w:before="0" w:after="80" w:line="240" w:lineRule="auto"/>
+        <w:jc w:val="center"/>
       </w:pPr>
       <w:r>
         <w:rPr>
@@ -6490,7 +6496,7 @@
           <w:i w:val="0"/>
           <w:sz w:val="19"/>
         </w:rPr>
-        <w:t>--------------------------------------------------------------------------------------------------------------------------------</w:t>
+        <w:t>----------------------------------------------------------------------------------------------------</w:t>
       </w:r>
     </w:p>
     <w:p>
@@ -6764,6 +6770,7 @@
     <w:p>
       <w:pPr>
         <w:spacing w:before="0" w:after="80" w:line="240" w:lineRule="auto"/>
+        <w:jc w:val="center"/>
       </w:pPr>
       <w:r>
         <w:rPr>
@@ -6772,7 +6779,7 @@
           <w:i w:val="0"/>
           <w:sz w:val="19"/>
         </w:rPr>
-        <w:t>--------------------------------------------------------------------------------------------------------------------------------</w:t>
+        <w:t>----------------------------------------------------------------------------------------------------</w:t>
       </w:r>
     </w:p>
     <w:p>
@@ -7362,6 +7369,7 @@
     <w:p>
       <w:pPr>
         <w:spacing w:before="0" w:after="80" w:line="240" w:lineRule="auto"/>
+        <w:jc w:val="center"/>
       </w:pPr>
       <w:r>
         <w:rPr>
@@ -7370,7 +7378,7 @@
           <w:i w:val="0"/>
           <w:sz w:val="19"/>
         </w:rPr>
-        <w:t>--------------------------------------------------------------------------------------------------------------------------------</w:t>
+        <w:t>----------------------------------------------------------------------------------------------------</w:t>
       </w:r>
     </w:p>
     <w:p>
@@ -8017,6 +8025,7 @@
     <w:p>
       <w:pPr>
         <w:spacing w:before="0" w:after="80" w:line="240" w:lineRule="auto"/>
+        <w:jc w:val="center"/>
       </w:pPr>
       <w:r>
         <w:rPr>
@@ -8025,7 +8034,7 @@
           <w:i w:val="0"/>
           <w:sz w:val="19"/>
         </w:rPr>
-        <w:t>--------------------------------------------------------------------------------------------------------------------------------</w:t>
+        <w:t>----------------------------------------------------------------------------------------------------</w:t>
       </w:r>
     </w:p>
     <w:p>
@@ -8325,6 +8334,7 @@
     <w:p>
       <w:pPr>
         <w:spacing w:before="0" w:after="80" w:line="240" w:lineRule="auto"/>
+        <w:jc w:val="center"/>
       </w:pPr>
       <w:r>
         <w:rPr>
@@ -8333,7 +8343,7 @@
           <w:i w:val="0"/>
           <w:sz w:val="19"/>
         </w:rPr>
-        <w:t>--------------------------------------------------------------------------------------------------------------------------------</w:t>
+        <w:t>----------------------------------------------------------------------------------------------------</w:t>
       </w:r>
     </w:p>
     <w:p>
@@ -8814,6 +8824,7 @@
     <w:p>
       <w:pPr>
         <w:spacing w:before="0" w:after="80" w:line="240" w:lineRule="auto"/>
+        <w:jc w:val="center"/>
       </w:pPr>
       <w:r>
         <w:rPr>
@@ -8822,7 +8833,7 @@
           <w:i w:val="0"/>
           <w:sz w:val="19"/>
         </w:rPr>
-        <w:t>--------------------------------------------------------------------------------------------------------------------------------</w:t>
+        <w:t>----------------------------------------------------------------------------------------------------</w:t>
       </w:r>
     </w:p>
     <w:p>
@@ -9386,6 +9397,7 @@
     <w:p>
       <w:pPr>
         <w:spacing w:before="0" w:after="80" w:line="240" w:lineRule="auto"/>
+        <w:jc w:val="center"/>
       </w:pPr>
       <w:r>
         <w:rPr>
@@ -9394,7 +9406,7 @@
           <w:i w:val="0"/>
           <w:sz w:val="19"/>
         </w:rPr>
-        <w:t>--------------------------------------------------------------------------------------------------------------------------------</w:t>
+        <w:t>----------------------------------------------------------------------------------------------------</w:t>
       </w:r>
     </w:p>
     <w:p>
@@ -9668,6 +9680,7 @@
     <w:p>
       <w:pPr>
         <w:spacing w:before="0" w:after="80" w:line="240" w:lineRule="auto"/>
+        <w:jc w:val="center"/>
       </w:pPr>
       <w:r>
         <w:rPr>
@@ -9676,7 +9689,7 @@
           <w:i w:val="0"/>
           <w:sz w:val="19"/>
         </w:rPr>
-        <w:t>--------------------------------------------------------------------------------------------------------------------------------</w:t>
+        <w:t>----------------------------------------------------------------------------------------------------</w:t>
       </w:r>
     </w:p>
     <w:p>
@@ -10266,6 +10279,7 @@
     <w:p>
       <w:pPr>
         <w:spacing w:before="0" w:after="80" w:line="240" w:lineRule="auto"/>
+        <w:jc w:val="center"/>
       </w:pPr>
       <w:r>
         <w:rPr>
@@ -10274,7 +10288,7 @@
           <w:i w:val="0"/>
           <w:sz w:val="19"/>
         </w:rPr>
-        <w:t>--------------------------------------------------------------------------------------------------------------------------------</w:t>
+        <w:t>----------------------------------------------------------------------------------------------------</w:t>
       </w:r>
     </w:p>
     <w:p>
@@ -10838,6 +10852,7 @@
     <w:p>
       <w:pPr>
         <w:spacing w:before="0" w:after="80" w:line="240" w:lineRule="auto"/>
+        <w:jc w:val="center"/>
       </w:pPr>
       <w:r>
         <w:rPr>
@@ -10846,7 +10861,7 @@
           <w:i w:val="0"/>
           <w:sz w:val="19"/>
         </w:rPr>
-        <w:t>--------------------------------------------------------------------------------------------------------------------------------</w:t>
+        <w:t>----------------------------------------------------------------------------------------------------</w:t>
       </w:r>
     </w:p>
     <w:p>
@@ -11120,6 +11135,7 @@
     <w:p>
       <w:pPr>
         <w:spacing w:before="0" w:after="80" w:line="240" w:lineRule="auto"/>
+        <w:jc w:val="center"/>
       </w:pPr>
       <w:r>
         <w:rPr>
@@ -11128,7 +11144,7 @@
           <w:i w:val="0"/>
           <w:sz w:val="19"/>
         </w:rPr>
-        <w:t>--------------------------------------------------------------------------------------------------------------------------------</w:t>
+        <w:t>----------------------------------------------------------------------------------------------------</w:t>
       </w:r>
     </w:p>
     <w:p>
@@ -11692,6 +11708,7 @@
     <w:p>
       <w:pPr>
         <w:spacing w:before="0" w:after="80" w:line="240" w:lineRule="auto"/>
+        <w:jc w:val="center"/>
       </w:pPr>
       <w:r>
         <w:rPr>
@@ -11700,7 +11717,7 @@
           <w:i w:val="0"/>
           <w:sz w:val="19"/>
         </w:rPr>
-        <w:t>--------------------------------------------------------------------------------------------------------------------------------</w:t>
+        <w:t>----------------------------------------------------------------------------------------------------</w:t>
       </w:r>
     </w:p>
     <w:p>
@@ -12290,6 +12307,7 @@
     <w:p>
       <w:pPr>
         <w:spacing w:before="0" w:after="80" w:line="240" w:lineRule="auto"/>
+        <w:jc w:val="center"/>
       </w:pPr>
       <w:r>
         <w:rPr>
@@ -12298,7 +12316,7 @@
           <w:i w:val="0"/>
           <w:sz w:val="19"/>
         </w:rPr>
-        <w:t>--------------------------------------------------------------------------------------------------------------------------------</w:t>
+        <w:t>----------------------------------------------------------------------------------------------------</w:t>
       </w:r>
     </w:p>
     <w:p>
@@ -12598,6 +12616,7 @@
     <w:p>
       <w:pPr>
         <w:spacing w:before="0" w:after="80" w:line="240" w:lineRule="auto"/>
+        <w:jc w:val="center"/>
       </w:pPr>
       <w:r>
         <w:rPr>
@@ -12606,7 +12625,7 @@
           <w:i w:val="0"/>
           <w:sz w:val="19"/>
         </w:rPr>
-        <w:t>--------------------------------------------------------------------------------------------------------------------------------</w:t>
+        <w:t>----------------------------------------------------------------------------------------------------</w:t>
       </w:r>
     </w:p>
     <w:p>
@@ -13113,6 +13132,7 @@
     <w:p>
       <w:pPr>
         <w:spacing w:before="0" w:after="80" w:line="240" w:lineRule="auto"/>
+        <w:jc w:val="center"/>
       </w:pPr>
       <w:r>
         <w:rPr>
@@ -13121,7 +13141,7 @@
           <w:i w:val="0"/>
           <w:sz w:val="19"/>
         </w:rPr>
-        <w:t>--------------------------------------------------------------------------------------------------------------------------------</w:t>
+        <w:t>----------------------------------------------------------------------------------------------------</w:t>
       </w:r>
     </w:p>
     <w:p>

</xml_diff>